<commit_message>
Add haiku documents, images, and new furigana converter files
Co-Authored-By: Claude Sonnet 5 <noreply@anthropic.com>
</commit_message>
<xml_diff>
--- a/five little fish.docx
+++ b/five little fish.docx
@@ -894,7 +894,7 @@
                   <wp:posOffset>-563771</wp:posOffset>
                 </wp:positionH>
                 <wp:positionV relativeFrom="paragraph">
-                  <wp:posOffset>4990825</wp:posOffset>
+                  <wp:posOffset>6352899</wp:posOffset>
                 </wp:positionV>
                 <wp:extent cx="1600617" cy="600075"/>
                 <wp:effectExtent l="3175" t="3175" r="3175" b="3175"/>
@@ -936,7 +936,7 @@
                                 <w:sz w:val="18"/>
                                 <w:szCs w:val="18"/>
                               </w:rPr>
-                              <w:t xml:space="preserve">The cry of a deer</w:t>
+                              <w:t xml:space="preserve">Grandmother's hand—</w:t>
                             </w:r>
                             <w:r/>
                           </w:p>
@@ -955,7 +955,7 @@
                                 <w:sz w:val="18"/>
                                 <w:szCs w:val="18"/>
                               </w:rPr>
-                              <w:t xml:space="preserve">drifts across the mountain</w:t>
+                              <w:t xml:space="preserve">five little fish gather</w:t>
                             </w:r>
                             <w:r/>
                           </w:p>
@@ -980,11 +980,12 @@
                                 <w:sz w:val="18"/>
                                 <w:szCs w:val="18"/>
                               </w:rPr>
-                              <w:t xml:space="preserve">into evening.</w:t>
+                              <w:t xml:space="preserve">in a circle.</w:t>
                             </w:r>
+                            <w:r/>
                             <w:r>
                               <w:rPr>
-                                <w:rFonts w:ascii="Open Sans" w:hAnsi="Open Sans" w:cs="Open Sans"/>
+                                <w:rFonts w:ascii="Open Sans" w:hAnsi="Open Sans" w:eastAsia="Open Sans" w:cs="Open Sans"/>
                                 <w:b w:val="0"/>
                                 <w:bCs w:val="0"/>
                                 <w:sz w:val="18"/>
@@ -1012,7 +1013,7 @@
           </mc:Choice>
           <mc:Fallback>
             <w:pict>
-              <v:shape id="shape 5" o:spid="_x0000_s5" o:spt="202" type="#_x0000_t202" style="position:absolute;z-index:11264;o:allowoverlap:true;o:allowincell:true;mso-position-horizontal-relative:text;margin-left:-44.39pt;mso-position-horizontal:absolute;mso-position-vertical-relative:text;margin-top:392.98pt;mso-position-vertical:absolute;width:126.03pt;height:47.25pt;mso-wrap-distance-left:9.07pt;mso-wrap-distance-top:0.00pt;mso-wrap-distance-right:9.07pt;mso-wrap-distance-bottom:0.00pt;rotation:90;v-text-anchor:top;visibility:visible;" filled="f" stroked="f" strokeweight="0.50pt">
+              <v:shape id="shape 5" o:spid="_x0000_s5" o:spt="202" type="#_x0000_t202" style="position:absolute;z-index:11264;o:allowoverlap:true;o:allowincell:true;mso-position-horizontal-relative:text;margin-left:-44.39pt;mso-position-horizontal:absolute;mso-position-vertical-relative:text;margin-top:500.23pt;mso-position-vertical:absolute;width:126.03pt;height:47.25pt;mso-wrap-distance-left:9.07pt;mso-wrap-distance-top:0.00pt;mso-wrap-distance-right:9.07pt;mso-wrap-distance-bottom:0.00pt;rotation:90;v-text-anchor:top;visibility:visible;" filled="f" stroked="f" strokeweight="0.50pt">
                 <v:textbox inset="0,0,0,0">
                   <w:txbxContent>
                     <w:p>
@@ -1030,7 +1031,7 @@
                           <w:sz w:val="18"/>
                           <w:szCs w:val="18"/>
                         </w:rPr>
-                        <w:t xml:space="preserve">The cry of a deer</w:t>
+                        <w:t xml:space="preserve">Grandmother's hand—</w:t>
                       </w:r>
                       <w:r/>
                     </w:p>
@@ -1049,7 +1050,7 @@
                           <w:sz w:val="18"/>
                           <w:szCs w:val="18"/>
                         </w:rPr>
-                        <w:t xml:space="preserve">drifts across the mountain</w:t>
+                        <w:t xml:space="preserve">five little fish gather</w:t>
                       </w:r>
                       <w:r/>
                     </w:p>
@@ -1074,11 +1075,12 @@
                           <w:sz w:val="18"/>
                           <w:szCs w:val="18"/>
                         </w:rPr>
-                        <w:t xml:space="preserve">into evening.</w:t>
+                        <w:t xml:space="preserve">in a circle.</w:t>
                       </w:r>
+                      <w:r/>
                       <w:r>
                         <w:rPr>
-                          <w:rFonts w:ascii="Open Sans" w:hAnsi="Open Sans" w:cs="Open Sans"/>
+                          <w:rFonts w:ascii="Open Sans" w:hAnsi="Open Sans" w:eastAsia="Open Sans" w:cs="Open Sans"/>
                           <w:b w:val="0"/>
                           <w:bCs w:val="0"/>
                           <w:sz w:val="18"/>
@@ -1109,12 +1111,12 @@
               <wp:anchor xmlns:wp="http://schemas.openxmlformats.org/drawingml/2006/wordprocessingDrawing" xmlns:wp14="http://schemas.microsoft.com/office/word/2010/wordprocessingDrawing" distT="0" distB="0" distL="115200" distR="115200" simplePos="0" relativeHeight="11264" behindDoc="0" locked="0" layoutInCell="1" allowOverlap="1">
                 <wp:simplePos x="0" y="0"/>
                 <wp:positionH relativeFrom="column">
-                  <wp:posOffset>-877887</wp:posOffset>
+                  <wp:posOffset>-549552</wp:posOffset>
                 </wp:positionH>
                 <wp:positionV relativeFrom="paragraph">
-                  <wp:posOffset>6905558</wp:posOffset>
+                  <wp:posOffset>4872248</wp:posOffset>
                 </wp:positionV>
-                <wp:extent cx="2228848" cy="600075"/>
+                <wp:extent cx="1476928" cy="600075"/>
                 <wp:effectExtent l="3175" t="3175" r="3175" b="3175"/>
                 <wp:wrapNone/>
                 <wp:docPr id="7" name=""/>
@@ -1127,7 +1129,7 @@
                       <wps:spPr bwMode="auto">
                         <a:xfrm rot="5400000" flipH="0" flipV="0">
                           <a:off x="0" y="0"/>
-                          <a:ext cx="2228847" cy="600075"/>
+                          <a:ext cx="1476927" cy="600075"/>
                         </a:xfrm>
                         <a:prstGeom prst="rect">
                           <a:avLst/>
@@ -1230,7 +1232,7 @@
           </mc:Choice>
           <mc:Fallback>
             <w:pict>
-              <v:shape id="shape 6" o:spid="_x0000_s6" o:spt="202" type="#_x0000_t202" style="position:absolute;z-index:11264;o:allowoverlap:true;o:allowincell:true;mso-position-horizontal-relative:text;margin-left:-69.12pt;mso-position-horizontal:absolute;mso-position-vertical-relative:text;margin-top:543.74pt;mso-position-vertical:absolute;width:175.50pt;height:47.25pt;mso-wrap-distance-left:9.07pt;mso-wrap-distance-top:0.00pt;mso-wrap-distance-right:9.07pt;mso-wrap-distance-bottom:0.00pt;rotation:90;v-text-anchor:top;visibility:visible;" filled="f" stroked="f" strokeweight="0.50pt">
+              <v:shape id="shape 6" o:spid="_x0000_s6" o:spt="202" type="#_x0000_t202" style="position:absolute;z-index:11264;o:allowoverlap:true;o:allowincell:true;mso-position-horizontal-relative:text;margin-left:-43.27pt;mso-position-horizontal:absolute;mso-position-vertical-relative:text;margin-top:383.64pt;mso-position-vertical:absolute;width:116.29pt;height:47.25pt;mso-wrap-distance-left:9.07pt;mso-wrap-distance-top:0.00pt;mso-wrap-distance-right:9.07pt;mso-wrap-distance-bottom:0.00pt;rotation:90;v-text-anchor:top;visibility:visible;" filled="f" stroked="f" strokeweight="0.50pt">
                 <v:textbox inset="0,0,0,0">
                   <w:txbxContent>
                     <w:p>

</xml_diff>